<commit_message>
perbaikan menu dan keuangan
</commit_message>
<xml_diff>
--- a/public/templates/template_spr.docx
+++ b/public/templates/template_spr.docx
@@ -469,7 +469,7 @@
       <w:r>
         <w:rPr>
           <w:rFonts w:ascii="Times New Roman" w:hAnsi="Times New Roman" w:cs="Times New Roman"/>
-          <w:color w:val="FFFFFF" w:themeColor="background1"/>
+          <w:color w:val="000000"/>
         </w:rPr>
         <w:t xml:space="preserve">${nama}</w:t>
       </w:r>
@@ -477,7 +477,7 @@
       <w:r>
         <w:rPr>
           <w:rFonts w:ascii="Times New Roman" w:hAnsi="Times New Roman" w:cs="Times New Roman"/>
-          <w:color w:val="FFFFFF" w:themeColor="background1"/>
+          <w:color w:val="000000"/>
         </w:rPr>
         <w:t xml:space="preserve"/>
       </w:r>
@@ -485,7 +485,7 @@
       <w:r>
         <w:rPr>
           <w:rFonts w:ascii="Times New Roman" w:hAnsi="Times New Roman" w:cs="Times New Roman"/>
-          <w:color w:val="FFFFFF" w:themeColor="background1"/>
+          <w:color w:val="000000"/>
         </w:rPr>
         <w:t xml:space="preserve"/>
       </w:r>
@@ -493,7 +493,7 @@
       <w:r>
         <w:rPr>
           <w:rFonts w:ascii="Times New Roman" w:hAnsi="Times New Roman" w:cs="Times New Roman"/>
-          <w:color w:val="FFFFFF" w:themeColor="background1"/>
+          <w:color w:val="000000"/>
         </w:rPr>
         <w:t xml:space="preserve"/>
       </w:r>
@@ -501,7 +501,7 @@
       <w:r>
         <w:rPr>
           <w:rFonts w:ascii="Times New Roman" w:hAnsi="Times New Roman" w:cs="Times New Roman"/>
-          <w:color w:val="FFFFFF" w:themeColor="background1"/>
+          <w:color w:val="000000"/>
         </w:rPr>
         <w:t xml:space="preserve"/>
       </w:r>
@@ -536,7 +536,7 @@
       <w:r>
         <w:rPr>
           <w:rFonts w:ascii="Times New Roman" w:hAnsi="Times New Roman" w:cs="Times New Roman"/>
-          <w:color w:val="FFFFFF" w:themeColor="background1"/>
+          <w:color w:val="000000"/>
         </w:rPr>
         <w:t xml:space="preserve">${nik}</w:t>
       </w:r>
@@ -550,7 +550,7 @@
         <w:ind w:left="2268" w:hanging="2268"/>
         <w:rPr>
           <w:rFonts w:ascii="Times New Roman" w:hAnsi="Times New Roman" w:cs="Times New Roman"/>
-          <w:color w:val="FFFFFF" w:themeColor="background1"/>
+          <w:color w:val="000000"/>
         </w:rPr>
       </w:pPr>
       <w:proofErr w:type="spellStart"/>
@@ -577,7 +577,7 @@
       <w:r>
         <w:rPr>
           <w:rFonts w:ascii="Times New Roman" w:hAnsi="Times New Roman" w:cs="Times New Roman"/>
-          <w:color w:val="FFFFFF" w:themeColor="background1"/>
+          <w:color w:val="000000"/>
         </w:rPr>
         <w:t xml:space="preserve">${alamat}</w:t>
       </w:r>
@@ -585,7 +585,7 @@
       <w:r>
         <w:rPr>
           <w:rFonts w:ascii="Times New Roman" w:hAnsi="Times New Roman" w:cs="Times New Roman"/>
-          <w:color w:val="FFFFFF" w:themeColor="background1"/>
+          <w:color w:val="000000"/>
         </w:rPr>
         <w:t xml:space="preserve"/>
       </w:r>
@@ -593,7 +593,7 @@
       <w:r>
         <w:rPr>
           <w:rFonts w:ascii="Times New Roman" w:hAnsi="Times New Roman" w:cs="Times New Roman"/>
-          <w:color w:val="FFFFFF" w:themeColor="background1"/>
+          <w:color w:val="000000"/>
         </w:rPr>
         <w:t xml:space="preserve"/>
       </w:r>
@@ -601,7 +601,7 @@
       <w:r>
         <w:rPr>
           <w:rFonts w:ascii="Times New Roman" w:hAnsi="Times New Roman" w:cs="Times New Roman"/>
-          <w:color w:val="FFFFFF" w:themeColor="background1"/>
+          <w:color w:val="000000"/>
         </w:rPr>
         <w:t xml:space="preserve"/>
       </w:r>
@@ -609,7 +609,7 @@
       <w:r>
         <w:rPr>
           <w:rFonts w:ascii="Times New Roman" w:hAnsi="Times New Roman" w:cs="Times New Roman"/>
-          <w:color w:val="FFFFFF" w:themeColor="background1"/>
+          <w:color w:val="000000"/>
         </w:rPr>
         <w:t xml:space="preserve"/>
       </w:r>
@@ -617,7 +617,7 @@
       <w:r>
         <w:rPr>
           <w:rFonts w:ascii="Times New Roman" w:hAnsi="Times New Roman" w:cs="Times New Roman"/>
-          <w:color w:val="FFFFFF" w:themeColor="background1"/>
+          <w:color w:val="000000"/>
         </w:rPr>
         <w:t xml:space="preserve"/>
       </w:r>
@@ -625,7 +625,7 @@
       <w:r>
         <w:rPr>
           <w:rFonts w:ascii="Times New Roman" w:hAnsi="Times New Roman" w:cs="Times New Roman"/>
-          <w:color w:val="FFFFFF" w:themeColor="background1"/>
+          <w:color w:val="000000"/>
         </w:rPr>
         <w:t xml:space="preserve"/>
       </w:r>
@@ -633,7 +633,7 @@
       <w:r>
         <w:rPr>
           <w:rFonts w:ascii="Times New Roman" w:hAnsi="Times New Roman" w:cs="Times New Roman"/>
-          <w:color w:val="FFFFFF" w:themeColor="background1"/>
+          <w:color w:val="000000"/>
         </w:rPr>
         <w:t xml:space="preserve"/>
       </w:r>
@@ -642,7 +642,7 @@
       <w:r>
         <w:rPr>
           <w:rFonts w:ascii="Times New Roman" w:hAnsi="Times New Roman" w:cs="Times New Roman"/>
-          <w:color w:val="FFFFFF" w:themeColor="background1"/>
+          <w:color w:val="000000"/>
         </w:rPr>
         <w:t xml:space="preserve"/>
       </w:r>
@@ -650,7 +650,7 @@
       <w:r>
         <w:rPr>
           <w:rFonts w:ascii="Times New Roman" w:hAnsi="Times New Roman" w:cs="Times New Roman"/>
-          <w:color w:val="FFFFFF" w:themeColor="background1"/>
+          <w:color w:val="000000"/>
         </w:rPr>
         <w:t xml:space="preserve"/>
       </w:r>
@@ -658,7 +658,7 @@
       <w:r>
         <w:rPr>
           <w:rFonts w:ascii="Times New Roman" w:hAnsi="Times New Roman" w:cs="Times New Roman"/>
-          <w:color w:val="FFFFFF" w:themeColor="background1"/>
+          <w:color w:val="000000"/>
         </w:rPr>
         <w:t xml:space="preserve"/>
       </w:r>
@@ -666,7 +666,7 @@
       <w:r>
         <w:rPr>
           <w:rFonts w:ascii="Times New Roman" w:hAnsi="Times New Roman" w:cs="Times New Roman"/>
-          <w:color w:val="FFFFFF" w:themeColor="background1"/>
+          <w:color w:val="000000"/>
         </w:rPr>
         <w:t xml:space="preserve"/>
       </w:r>
@@ -674,7 +674,7 @@
       <w:r>
         <w:rPr>
           <w:rFonts w:ascii="Times New Roman" w:hAnsi="Times New Roman" w:cs="Times New Roman"/>
-          <w:color w:val="FFFFFF" w:themeColor="background1"/>
+          <w:color w:val="000000"/>
         </w:rPr>
         <w:t xml:space="preserve"/>
       </w:r>
@@ -682,7 +682,7 @@
       <w:r>
         <w:rPr>
           <w:rFonts w:ascii="Times New Roman" w:hAnsi="Times New Roman" w:cs="Times New Roman"/>
-          <w:color w:val="FFFFFF" w:themeColor="background1"/>
+          <w:color w:val="000000"/>
         </w:rPr>
         <w:t xml:space="preserve"/>
       </w:r>
@@ -690,7 +690,7 @@
       <w:r>
         <w:rPr>
           <w:rFonts w:ascii="Times New Roman" w:hAnsi="Times New Roman" w:cs="Times New Roman"/>
-          <w:color w:val="FFFFFF" w:themeColor="background1"/>
+          <w:color w:val="000000"/>
         </w:rPr>
         <w:t xml:space="preserve"/>
       </w:r>
@@ -723,14 +723,14 @@
       <w:r>
         <w:rPr>
           <w:rFonts w:ascii="Times New Roman" w:eastAsia="Times New Roman" w:hAnsi="Times New Roman" w:cs="Times New Roman"/>
-          <w:color w:val="FFFFFF" w:themeColor="background1"/>
+          <w:color w:val="000000"/>
         </w:rPr>
         <w:t xml:space="preserve">${no_telp}</w:t>
       </w:r>
       <w:r>
         <w:rPr>
           <w:rFonts w:ascii="Times New Roman" w:eastAsia="Times New Roman" w:hAnsi="Times New Roman" w:cs="Times New Roman"/>
-          <w:color w:val="FFFFFF" w:themeColor="background1"/>
+          <w:color w:val="000000"/>
         </w:rPr>
         <w:t xml:space="preserve"/>
       </w:r>
@@ -980,7 +980,7 @@
       <w:r>
         <w:rPr>
           <w:rFonts w:ascii="Times New Roman" w:hAnsi="Times New Roman" w:cs="Times New Roman"/>
-          <w:color w:val="FFFFFF" w:themeColor="background1"/>
+          <w:color w:val="000000"/>
         </w:rPr>
         <w:t xml:space="preserve">${kavling}</w:t>
       </w:r>
@@ -988,7 +988,7 @@
       <w:r>
         <w:rPr>
           <w:rFonts w:ascii="Times New Roman" w:hAnsi="Times New Roman" w:cs="Times New Roman"/>
-          <w:color w:val="FFFFFF" w:themeColor="background1"/>
+          <w:color w:val="000000"/>
         </w:rPr>
         <w:t xml:space="preserve"/>
       </w:r>
@@ -1036,7 +1036,7 @@
       <w:r>
         <w:rPr>
           <w:rFonts w:ascii="Times New Roman" w:hAnsi="Times New Roman" w:cs="Times New Roman"/>
-          <w:color w:val="FFFFFF" w:themeColor="background1"/>
+          <w:color w:val="000000"/>
         </w:rPr>
         <w:t/>
       </w:r>
@@ -1093,7 +1093,7 @@
       <w:r>
         <w:rPr>
           <w:rFonts w:ascii="Times New Roman" w:hAnsi="Times New Roman" w:cs="Times New Roman"/>
-          <w:color w:val="FFFFFF" w:themeColor="background1"/>
+          <w:color w:val="000000"/>
         </w:rPr>
         <w:t/>
       </w:r>
@@ -1133,7 +1133,7 @@
         <w:spacing w:after="120" w:line="240" w:lineRule="auto"/>
         <w:rPr>
           <w:rFonts w:ascii="Times New Roman" w:hAnsi="Times New Roman" w:cs="Times New Roman"/>
-          <w:color w:val="FFFFFF" w:themeColor="background1"/>
+          <w:color w:val="000000"/>
         </w:rPr>
       </w:pPr>
       <w:proofErr w:type="spellStart"/>
@@ -1167,22 +1167,22 @@
       <w:r>
         <w:rPr>
           <w:rFonts w:ascii="Times New Roman" w:hAnsi="Times New Roman" w:cs="Times New Roman"/>
-          <w:color w:val="FFFFFF" w:themeColor="background1"/>
+          <w:color w:val="000000"/>
         </w:rPr>
         <w:t xml:space="preserve">: </w:t>
       </w:r>
       <w:r>
         <w:rPr>
           <w:rFonts w:ascii="Times New Roman" w:hAnsi="Times New Roman" w:cs="Times New Roman"/>
-          <w:color w:val="FFFFFF" w:themeColor="background1"/>
-        </w:rPr>
-        <w:t xml:space="preserve"> </w:t>
-      </w:r>
-      <w:proofErr w:type="spellStart"/>
-      <w:r>
-        <w:rPr>
-          <w:rFonts w:ascii="Times New Roman" w:hAnsi="Times New Roman" w:cs="Times New Roman"/>
-          <w:color w:val="FFFFFF" w:themeColor="background1"/>
+          <w:color w:val="000000"/>
+        </w:rPr>
+        <w:t xml:space="preserve"> </w:t>
+      </w:r>
+      <w:proofErr w:type="spellStart"/>
+      <w:r>
+        <w:rPr>
+          <w:rFonts w:ascii="Times New Roman" w:hAnsi="Times New Roman" w:cs="Times New Roman"/>
+          <w:color w:val="000000"/>
         </w:rPr>
         <w:t>Rp</w:t>
       </w:r>
@@ -1190,21 +1190,21 @@
       <w:r>
         <w:rPr>
           <w:rFonts w:ascii="Times New Roman" w:hAnsi="Times New Roman" w:cs="Times New Roman"/>
-          <w:color w:val="FFFFFF" w:themeColor="background1"/>
+          <w:color w:val="000000"/>
         </w:rPr>
         <w:t xml:space="preserve">. </w:t>
       </w:r>
       <w:r>
         <w:rPr>
           <w:rFonts w:ascii="Times New Roman" w:hAnsi="Times New Roman" w:cs="Times New Roman"/>
-          <w:color w:val="FFFFFF" w:themeColor="background1"/>
+          <w:color w:val="000000"/>
         </w:rPr>
         <w:t xml:space="preserve">${harga_jual}</w:t>
       </w:r>
       <w:r>
         <w:rPr>
           <w:rFonts w:ascii="Times New Roman" w:hAnsi="Times New Roman" w:cs="Times New Roman"/>
-          <w:color w:val="FFFFFF" w:themeColor="background1"/>
+          <w:color w:val="000000"/>
         </w:rPr>
         <w:t>,- (</w:t>
       </w:r>
@@ -1212,7 +1212,7 @@
       <w:r>
         <w:rPr>
           <w:rFonts w:ascii="Times New Roman" w:hAnsi="Times New Roman" w:cs="Times New Roman"/>
-          <w:color w:val="FFFFFF" w:themeColor="background1"/>
+          <w:color w:val="000000"/>
         </w:rPr>
         <w:t xml:space="preserve">${harga_terbilang}</w:t>
       </w:r>
@@ -1220,7 +1220,7 @@
       <w:r>
         <w:rPr>
           <w:rFonts w:ascii="Times New Roman" w:hAnsi="Times New Roman" w:cs="Times New Roman"/>
-          <w:color w:val="FFFFFF" w:themeColor="background1"/>
+          <w:color w:val="000000"/>
         </w:rPr>
         <w:t xml:space="preserve"/>
       </w:r>
@@ -1228,7 +1228,7 @@
       <w:r>
         <w:rPr>
           <w:rFonts w:ascii="Times New Roman" w:hAnsi="Times New Roman" w:cs="Times New Roman"/>
-          <w:color w:val="FFFFFF" w:themeColor="background1"/>
+          <w:color w:val="000000"/>
         </w:rPr>
         <w:t xml:space="preserve"/>
       </w:r>
@@ -1236,7 +1236,7 @@
       <w:r>
         <w:rPr>
           <w:rFonts w:ascii="Times New Roman" w:hAnsi="Times New Roman" w:cs="Times New Roman"/>
-          <w:color w:val="FFFFFF" w:themeColor="background1"/>
+          <w:color w:val="000000"/>
         </w:rPr>
         <w:t xml:space="preserve"/>
       </w:r>
@@ -1244,7 +1244,7 @@
       <w:r>
         <w:rPr>
           <w:rFonts w:ascii="Times New Roman" w:hAnsi="Times New Roman" w:cs="Times New Roman"/>
-          <w:color w:val="FFFFFF" w:themeColor="background1"/>
+          <w:color w:val="000000"/>
         </w:rPr>
         <w:t xml:space="preserve"/>
       </w:r>
@@ -1252,7 +1252,7 @@
       <w:r>
         <w:rPr>
           <w:rFonts w:ascii="Times New Roman" w:hAnsi="Times New Roman" w:cs="Times New Roman"/>
-          <w:color w:val="FFFFFF" w:themeColor="background1"/>
+          <w:color w:val="000000"/>
         </w:rPr>
         <w:t xml:space="preserve"/>
       </w:r>
@@ -1260,7 +1260,7 @@
       <w:r>
         <w:rPr>
           <w:rFonts w:ascii="Times New Roman" w:hAnsi="Times New Roman" w:cs="Times New Roman"/>
-          <w:color w:val="FFFFFF" w:themeColor="background1"/>
+          <w:color w:val="000000"/>
         </w:rPr>
         <w:t xml:space="preserve"/>
       </w:r>
@@ -1268,7 +1268,7 @@
       <w:r>
         <w:rPr>
           <w:rFonts w:ascii="Times New Roman" w:hAnsi="Times New Roman" w:cs="Times New Roman"/>
-          <w:color w:val="FFFFFF" w:themeColor="background1"/>
+          <w:color w:val="000000"/>
         </w:rPr>
         <w:t xml:space="preserve"/>
       </w:r>
@@ -1276,7 +1276,7 @@
       <w:r>
         <w:rPr>
           <w:rFonts w:ascii="Times New Roman" w:hAnsi="Times New Roman" w:cs="Times New Roman"/>
-          <w:color w:val="FFFFFF" w:themeColor="background1"/>
+          <w:color w:val="000000"/>
         </w:rPr>
         <w:t xml:space="preserve"/>
       </w:r>
@@ -1284,14 +1284,14 @@
       <w:r>
         <w:rPr>
           <w:rFonts w:ascii="Times New Roman" w:hAnsi="Times New Roman" w:cs="Times New Roman"/>
-          <w:color w:val="FFFFFF" w:themeColor="background1"/>
+          <w:color w:val="000000"/>
         </w:rPr>
         <w:t xml:space="preserve"/>
       </w:r>
       <w:r>
         <w:rPr>
           <w:rFonts w:ascii="Times New Roman" w:hAnsi="Times New Roman" w:cs="Times New Roman"/>
-          <w:color w:val="FFFFFF" w:themeColor="background1"/>
+          <w:color w:val="000000"/>
         </w:rPr>
         <w:t xml:space="preserve">)               </w:t>
       </w:r>
@@ -1302,13 +1302,13 @@
         <w:spacing w:after="120" w:line="240" w:lineRule="auto"/>
         <w:rPr>
           <w:rFonts w:ascii="Times New Roman" w:hAnsi="Times New Roman" w:cs="Times New Roman"/>
-          <w:color w:val="FFFFFF" w:themeColor="background1"/>
-        </w:rPr>
-      </w:pPr>
-      <w:r>
-        <w:rPr>
-          <w:rFonts w:ascii="Times New Roman" w:hAnsi="Times New Roman" w:cs="Times New Roman"/>
-          <w:color w:val="FFFFFF" w:themeColor="background1"/>
+          <w:color w:val="000000"/>
+        </w:rPr>
+      </w:pPr>
+      <w:r>
+        <w:rPr>
+          <w:rFonts w:ascii="Times New Roman" w:hAnsi="Times New Roman" w:cs="Times New Roman"/>
+          <w:color w:val="000000"/>
         </w:rPr>
         <w:t>*</w:t>
       </w:r>
@@ -1316,7 +1316,7 @@
       <w:r>
         <w:rPr>
           <w:rFonts w:ascii="Times New Roman" w:hAnsi="Times New Roman" w:cs="Times New Roman"/>
-          <w:color w:val="FFFFFF" w:themeColor="background1"/>
+          <w:color w:val="000000"/>
         </w:rPr>
         <w:t>harga</w:t>
       </w:r>
@@ -1324,15 +1324,15 @@
       <w:r>
         <w:rPr>
           <w:rFonts w:ascii="Times New Roman" w:hAnsi="Times New Roman" w:cs="Times New Roman"/>
-          <w:color w:val="FFFFFF" w:themeColor="background1"/>
-        </w:rPr>
-        <w:t xml:space="preserve"> </w:t>
-      </w:r>
-      <w:proofErr w:type="spellStart"/>
-      <w:r>
-        <w:rPr>
-          <w:rFonts w:ascii="Times New Roman" w:hAnsi="Times New Roman" w:cs="Times New Roman"/>
-          <w:color w:val="FFFFFF" w:themeColor="background1"/>
+          <w:color w:val="000000"/>
+        </w:rPr>
+        <w:t xml:space="preserve"> </w:t>
+      </w:r>
+      <w:proofErr w:type="spellStart"/>
+      <w:r>
+        <w:rPr>
+          <w:rFonts w:ascii="Times New Roman" w:hAnsi="Times New Roman" w:cs="Times New Roman"/>
+          <w:color w:val="000000"/>
         </w:rPr>
         <w:t>tersebut</w:t>
       </w:r>
@@ -1340,15 +1340,15 @@
       <w:r>
         <w:rPr>
           <w:rFonts w:ascii="Times New Roman" w:hAnsi="Times New Roman" w:cs="Times New Roman"/>
-          <w:color w:val="FFFFFF" w:themeColor="background1"/>
-        </w:rPr>
-        <w:t xml:space="preserve"> </w:t>
-      </w:r>
-      <w:proofErr w:type="spellStart"/>
-      <w:r>
-        <w:rPr>
-          <w:rFonts w:ascii="Times New Roman" w:hAnsi="Times New Roman" w:cs="Times New Roman"/>
-          <w:color w:val="FFFFFF" w:themeColor="background1"/>
+          <w:color w:val="000000"/>
+        </w:rPr>
+        <w:t xml:space="preserve"> </w:t>
+      </w:r>
+      <w:proofErr w:type="spellStart"/>
+      <w:r>
+        <w:rPr>
+          <w:rFonts w:ascii="Times New Roman" w:hAnsi="Times New Roman" w:cs="Times New Roman"/>
+          <w:color w:val="000000"/>
         </w:rPr>
         <w:t>sesuai</w:t>
       </w:r>
@@ -1356,15 +1356,15 @@
       <w:r>
         <w:rPr>
           <w:rFonts w:ascii="Times New Roman" w:hAnsi="Times New Roman" w:cs="Times New Roman"/>
-          <w:color w:val="FFFFFF" w:themeColor="background1"/>
-        </w:rPr>
-        <w:t xml:space="preserve"> </w:t>
-      </w:r>
-      <w:proofErr w:type="spellStart"/>
-      <w:r>
-        <w:rPr>
-          <w:rFonts w:ascii="Times New Roman" w:hAnsi="Times New Roman" w:cs="Times New Roman"/>
-          <w:color w:val="FFFFFF" w:themeColor="background1"/>
+          <w:color w:val="000000"/>
+        </w:rPr>
+        <w:t xml:space="preserve"> </w:t>
+      </w:r>
+      <w:proofErr w:type="spellStart"/>
+      <w:r>
+        <w:rPr>
+          <w:rFonts w:ascii="Times New Roman" w:hAnsi="Times New Roman" w:cs="Times New Roman"/>
+          <w:color w:val="000000"/>
         </w:rPr>
         <w:t>dengan</w:t>
       </w:r>
@@ -1372,15 +1372,15 @@
       <w:r>
         <w:rPr>
           <w:rFonts w:ascii="Times New Roman" w:hAnsi="Times New Roman" w:cs="Times New Roman"/>
-          <w:color w:val="FFFFFF" w:themeColor="background1"/>
-        </w:rPr>
-        <w:t xml:space="preserve"> </w:t>
-      </w:r>
-      <w:proofErr w:type="spellStart"/>
-      <w:r>
-        <w:rPr>
-          <w:rFonts w:ascii="Times New Roman" w:hAnsi="Times New Roman" w:cs="Times New Roman"/>
-          <w:color w:val="FFFFFF" w:themeColor="background1"/>
+          <w:color w:val="000000"/>
+        </w:rPr>
+        <w:t xml:space="preserve"> </w:t>
+      </w:r>
+      <w:proofErr w:type="spellStart"/>
+      <w:r>
+        <w:rPr>
+          <w:rFonts w:ascii="Times New Roman" w:hAnsi="Times New Roman" w:cs="Times New Roman"/>
+          <w:color w:val="000000"/>
         </w:rPr>
         <w:t>ketentuan</w:t>
       </w:r>
@@ -1388,7 +1388,7 @@
       <w:r>
         <w:rPr>
           <w:rFonts w:ascii="Times New Roman" w:hAnsi="Times New Roman" w:cs="Times New Roman"/>
-          <w:color w:val="FFFFFF" w:themeColor="background1"/>
+          <w:color w:val="000000"/>
         </w:rPr>
         <w:t xml:space="preserve"> </w:t>
       </w:r>
@@ -1397,7 +1397,7 @@
       <w:r>
         <w:rPr>
           <w:rFonts w:ascii="Times New Roman" w:hAnsi="Times New Roman" w:cs="Times New Roman"/>
-          <w:color w:val="FFFFFF" w:themeColor="background1"/>
+          <w:color w:val="000000"/>
         </w:rPr>
         <w:t>luas</w:t>
       </w:r>
@@ -1405,7 +1405,7 @@
       <w:r>
         <w:rPr>
           <w:rFonts w:ascii="Times New Roman" w:hAnsi="Times New Roman" w:cs="Times New Roman"/>
-          <w:color w:val="FFFFFF" w:themeColor="background1"/>
+          <w:color w:val="000000"/>
         </w:rPr>
         <w:t xml:space="preserve">  </w:t>
       </w:r>
@@ -1413,7 +1413,7 @@
       <w:r>
         <w:rPr>
           <w:rFonts w:ascii="Times New Roman" w:hAnsi="Times New Roman" w:cs="Times New Roman"/>
-          <w:color w:val="FFFFFF" w:themeColor="background1"/>
+          <w:color w:val="000000"/>
         </w:rPr>
         <w:t>tanah</w:t>
       </w:r>
@@ -1422,15 +1422,15 @@
       <w:r>
         <w:rPr>
           <w:rFonts w:ascii="Times New Roman" w:hAnsi="Times New Roman" w:cs="Times New Roman"/>
-          <w:color w:val="FFFFFF" w:themeColor="background1"/>
-        </w:rPr>
-        <w:t xml:space="preserve"> </w:t>
-      </w:r>
-      <w:proofErr w:type="spellStart"/>
-      <w:r>
-        <w:rPr>
-          <w:rFonts w:ascii="Times New Roman" w:hAnsi="Times New Roman" w:cs="Times New Roman"/>
-          <w:color w:val="FFFFFF" w:themeColor="background1"/>
+          <w:color w:val="000000"/>
+        </w:rPr>
+        <w:t xml:space="preserve"> </w:t>
+      </w:r>
+      <w:proofErr w:type="spellStart"/>
+      <w:r>
+        <w:rPr>
+          <w:rFonts w:ascii="Times New Roman" w:hAnsi="Times New Roman" w:cs="Times New Roman"/>
+          <w:color w:val="000000"/>
         </w:rPr>
         <w:t>dan</w:t>
       </w:r>
@@ -1438,15 +1438,15 @@
       <w:r>
         <w:rPr>
           <w:rFonts w:ascii="Times New Roman" w:hAnsi="Times New Roman" w:cs="Times New Roman"/>
-          <w:color w:val="FFFFFF" w:themeColor="background1"/>
-        </w:rPr>
-        <w:t xml:space="preserve"> </w:t>
-      </w:r>
-      <w:proofErr w:type="spellStart"/>
-      <w:r>
-        <w:rPr>
-          <w:rFonts w:ascii="Times New Roman" w:hAnsi="Times New Roman" w:cs="Times New Roman"/>
-          <w:color w:val="FFFFFF" w:themeColor="background1"/>
+          <w:color w:val="000000"/>
+        </w:rPr>
+        <w:t xml:space="preserve"> </w:t>
+      </w:r>
+      <w:proofErr w:type="spellStart"/>
+      <w:r>
+        <w:rPr>
+          <w:rFonts w:ascii="Times New Roman" w:hAnsi="Times New Roman" w:cs="Times New Roman"/>
+          <w:color w:val="000000"/>
         </w:rPr>
         <w:t>luas</w:t>
       </w:r>
@@ -1454,15 +1454,15 @@
       <w:r>
         <w:rPr>
           <w:rFonts w:ascii="Times New Roman" w:hAnsi="Times New Roman" w:cs="Times New Roman"/>
-          <w:color w:val="FFFFFF" w:themeColor="background1"/>
-        </w:rPr>
-        <w:t xml:space="preserve"> </w:t>
-      </w:r>
-      <w:proofErr w:type="spellStart"/>
-      <w:r>
-        <w:rPr>
-          <w:rFonts w:ascii="Times New Roman" w:hAnsi="Times New Roman" w:cs="Times New Roman"/>
-          <w:color w:val="FFFFFF" w:themeColor="background1"/>
+          <w:color w:val="000000"/>
+        </w:rPr>
+        <w:t xml:space="preserve"> </w:t>
+      </w:r>
+      <w:proofErr w:type="spellStart"/>
+      <w:r>
+        <w:rPr>
+          <w:rFonts w:ascii="Times New Roman" w:hAnsi="Times New Roman" w:cs="Times New Roman"/>
+          <w:color w:val="000000"/>
         </w:rPr>
         <w:t>bangunan</w:t>
       </w:r>
@@ -1470,7 +1470,7 @@
       <w:r>
         <w:rPr>
           <w:rFonts w:ascii="Times New Roman" w:hAnsi="Times New Roman" w:cs="Times New Roman"/>
-          <w:color w:val="FFFFFF" w:themeColor="background1"/>
+          <w:color w:val="000000"/>
         </w:rPr>
         <w:t xml:space="preserve"> di </w:t>
       </w:r>
@@ -1478,7 +1478,7 @@
       <w:r>
         <w:rPr>
           <w:rFonts w:ascii="Times New Roman" w:hAnsi="Times New Roman" w:cs="Times New Roman"/>
-          <w:color w:val="FFFFFF" w:themeColor="background1"/>
+          <w:color w:val="000000"/>
         </w:rPr>
         <w:t>atas</w:t>
       </w:r>
@@ -1486,14 +1486,14 @@
       <w:r>
         <w:rPr>
           <w:rFonts w:ascii="Times New Roman" w:hAnsi="Times New Roman" w:cs="Times New Roman"/>
-          <w:color w:val="FFFFFF" w:themeColor="background1"/>
-        </w:rPr>
-        <w:t xml:space="preserve"> </w:t>
-      </w:r>
-      <w:r>
-        <w:rPr>
-          <w:rFonts w:ascii="Times New Roman" w:hAnsi="Times New Roman" w:cs="Times New Roman"/>
-          <w:color w:val="FFFFFF" w:themeColor="background1"/>
+          <w:color w:val="000000"/>
+        </w:rPr>
+        <w:t xml:space="preserve"> </w:t>
+      </w:r>
+      <w:r>
+        <w:rPr>
+          <w:rFonts w:ascii="Times New Roman" w:hAnsi="Times New Roman" w:cs="Times New Roman"/>
+          <w:color w:val="000000"/>
         </w:rPr>
         <w:tab/>
         <w:t xml:space="preserve">   </w:t>
@@ -1505,20 +1505,20 @@
         <w:spacing w:after="120" w:line="240" w:lineRule="auto"/>
         <w:rPr>
           <w:rFonts w:ascii="Times New Roman" w:hAnsi="Times New Roman" w:cs="Times New Roman"/>
-          <w:color w:val="FFFFFF" w:themeColor="background1"/>
-        </w:rPr>
-      </w:pPr>
-      <w:r>
-        <w:rPr>
-          <w:rFonts w:ascii="Times New Roman" w:hAnsi="Times New Roman" w:cs="Times New Roman"/>
-          <w:color w:val="FFFFFF" w:themeColor="background1"/>
-        </w:rPr>
-        <w:t xml:space="preserve"> </w:t>
-      </w:r>
-      <w:r>
-        <w:rPr>
-          <w:rFonts w:ascii="Times New Roman" w:hAnsi="Times New Roman" w:cs="Times New Roman"/>
-          <w:color w:val="FFFFFF" w:themeColor="background1"/>
+          <w:color w:val="000000"/>
+        </w:rPr>
+      </w:pPr>
+      <w:r>
+        <w:rPr>
+          <w:rFonts w:ascii="Times New Roman" w:hAnsi="Times New Roman" w:cs="Times New Roman"/>
+          <w:color w:val="000000"/>
+        </w:rPr>
+        <w:t xml:space="preserve"> </w:t>
+      </w:r>
+      <w:r>
+        <w:rPr>
+          <w:rFonts w:ascii="Times New Roman" w:hAnsi="Times New Roman" w:cs="Times New Roman"/>
+          <w:color w:val="000000"/>
         </w:rPr>
         <w:tab/>
         <w:t xml:space="preserve">   </w:t>
@@ -1556,7 +1556,7 @@
       <w:r>
         <w:rPr>
           <w:rFonts w:ascii="Times New Roman" w:hAnsi="Times New Roman" w:cs="Times New Roman"/>
-          <w:color w:val="FFFFFF" w:themeColor="background1"/>
+          <w:color w:val="000000"/>
         </w:rPr>
         <w:t xml:space="preserve">${skema_pembayaran} </w:t>
       </w:r>
@@ -1723,7 +1723,7 @@
               <w:jc w:val="center"/>
               <w:rPr>
                 <w:rFonts w:ascii="Times New Roman" w:eastAsia="Times New Roman" w:hAnsi="Times New Roman" w:cs="Times New Roman"/>
-                <w:color w:val="FFFFFF" w:themeColor="background1"/>
+                <w:color w:val="000000"/>
                 <w:sz w:val="18"/>
                 <w:szCs w:val="18"/>
                 <w:lang w:val="en-ID" w:eastAsia="en-ID"/>
@@ -1732,7 +1732,7 @@
             <w:r>
               <w:rPr>
                 <w:rFonts w:ascii="Times New Roman" w:eastAsia="Times New Roman" w:hAnsi="Times New Roman" w:cs="Times New Roman"/>
-                <w:color w:val="FFFFFF" w:themeColor="background1"/>
+                <w:color w:val="000000"/>
                 <w:sz w:val="18"/>
                 <w:szCs w:val="18"/>
                 <w:lang w:val="en-ID" w:eastAsia="en-ID"/>
@@ -1751,7 +1751,7 @@
               <w:jc w:val="center"/>
               <w:rPr>
                 <w:rFonts w:ascii="Times New Roman" w:eastAsia="Times New Roman" w:hAnsi="Times New Roman" w:cs="Times New Roman"/>
-                <w:color w:val="FFFFFF" w:themeColor="background1"/>
+                <w:color w:val="000000"/>
                 <w:sz w:val="18"/>
                 <w:szCs w:val="18"/>
                 <w:lang w:val="en-ID" w:eastAsia="en-ID"/>
@@ -1761,7 +1761,7 @@
             <w:r>
               <w:rPr>
                 <w:rFonts w:ascii="Times New Roman" w:eastAsia="Times New Roman" w:hAnsi="Times New Roman" w:cs="Times New Roman"/>
-                <w:color w:val="FFFFFF" w:themeColor="background1"/>
+                <w:color w:val="000000"/>
                 <w:sz w:val="18"/>
                 <w:szCs w:val="18"/>
                 <w:lang w:val="en-ID" w:eastAsia="en-ID"/>
@@ -1772,7 +1772,7 @@
             <w:r>
               <w:rPr>
                 <w:rFonts w:ascii="Times New Roman" w:eastAsia="Times New Roman" w:hAnsi="Times New Roman" w:cs="Times New Roman"/>
-                <w:color w:val="FFFFFF" w:themeColor="background1"/>
+                <w:color w:val="000000"/>
                 <w:sz w:val="18"/>
                 <w:szCs w:val="18"/>
                 <w:lang w:val="en-ID" w:eastAsia="en-ID"/>
@@ -1791,7 +1791,7 @@
               <w:jc w:val="center"/>
               <w:rPr>
                 <w:rFonts w:ascii="Times New Roman" w:eastAsia="Times New Roman" w:hAnsi="Times New Roman" w:cs="Times New Roman"/>
-                <w:color w:val="FFFFFF" w:themeColor="background1"/>
+                <w:color w:val="000000"/>
                 <w:sz w:val="18"/>
                 <w:szCs w:val="18"/>
                 <w:lang w:val="en-ID" w:eastAsia="en-ID"/>
@@ -1800,7 +1800,7 @@
             <w:r>
               <w:rPr>
                 <w:rFonts w:ascii="Times New Roman" w:eastAsia="Times New Roman" w:hAnsi="Times New Roman" w:cs="Times New Roman"/>
-                <w:color w:val="FFFFFF" w:themeColor="background1"/>
+                <w:color w:val="000000"/>
                 <w:sz w:val="18"/>
                 <w:szCs w:val="18"/>
                 <w:lang w:val="en-ID" w:eastAsia="en-ID"/>
@@ -1818,7 +1818,7 @@
               <w:jc w:val="center"/>
               <w:rPr>
                 <w:rFonts w:ascii="Times New Roman" w:eastAsia="Times New Roman" w:hAnsi="Times New Roman" w:cs="Times New Roman"/>
-                <w:color w:val="FFFFFF" w:themeColor="background1"/>
+                <w:color w:val="000000"/>
                 <w:sz w:val="18"/>
                 <w:szCs w:val="18"/>
                 <w:lang w:val="en-ID" w:eastAsia="en-ID"/>
@@ -1828,7 +1828,7 @@
             <w:r>
               <w:rPr>
                 <w:rFonts w:ascii="Times New Roman" w:eastAsia="Times New Roman" w:hAnsi="Times New Roman" w:cs="Times New Roman"/>
-                <w:color w:val="FFFFFF" w:themeColor="background1"/>
+                <w:color w:val="000000"/>
                 <w:sz w:val="18"/>
                 <w:szCs w:val="18"/>
                 <w:lang w:val="en-ID" w:eastAsia="en-ID"/>
@@ -1839,7 +1839,7 @@
             <w:r>
               <w:rPr>
                 <w:rFonts w:ascii="Times New Roman" w:eastAsia="Times New Roman" w:hAnsi="Times New Roman" w:cs="Times New Roman"/>
-                <w:color w:val="FFFFFF" w:themeColor="background1"/>
+                <w:color w:val="000000"/>
                 <w:sz w:val="18"/>
                 <w:szCs w:val="18"/>
                 <w:lang w:val="en-ID" w:eastAsia="en-ID"/>
@@ -1857,7 +1857,7 @@
               <w:jc w:val="center"/>
               <w:rPr>
                 <w:rFonts w:ascii="Times New Roman" w:eastAsia="Times New Roman" w:hAnsi="Times New Roman" w:cs="Times New Roman"/>
-                <w:color w:val="FFFFFF" w:themeColor="background1"/>
+                <w:color w:val="000000"/>
                 <w:sz w:val="18"/>
                 <w:szCs w:val="18"/>
                 <w:lang w:val="en-ID" w:eastAsia="en-ID"/>
@@ -1866,7 +1866,7 @@
             <w:r>
               <w:rPr>
                 <w:rFonts w:ascii="Times New Roman" w:eastAsia="Times New Roman" w:hAnsi="Times New Roman" w:cs="Times New Roman"/>
-                <w:color w:val="FFFFFF" w:themeColor="background1"/>
+                <w:color w:val="000000"/>
                 <w:sz w:val="18"/>
                 <w:szCs w:val="18"/>
                 <w:lang w:val="en-ID" w:eastAsia="en-ID"/>
@@ -1877,7 +1877,7 @@
             <w:r>
               <w:rPr>
                 <w:rFonts w:ascii="Times New Roman" w:eastAsia="Times New Roman" w:hAnsi="Times New Roman" w:cs="Times New Roman"/>
-                <w:color w:val="FFFFFF" w:themeColor="background1"/>
+                <w:color w:val="000000"/>
                 <w:sz w:val="18"/>
                 <w:szCs w:val="18"/>
                 <w:lang w:val="en-ID" w:eastAsia="en-ID"/>
@@ -1888,7 +1888,7 @@
             <w:r>
               <w:rPr>
                 <w:rFonts w:ascii="Times New Roman" w:eastAsia="Times New Roman" w:hAnsi="Times New Roman" w:cs="Times New Roman"/>
-                <w:color w:val="FFFFFF" w:themeColor="background1"/>
+                <w:color w:val="000000"/>
                 <w:sz w:val="18"/>
                 <w:szCs w:val="18"/>
                 <w:lang w:val="en-ID" w:eastAsia="en-ID"/>
@@ -1913,7 +1913,7 @@
               <w:jc w:val="center"/>
               <w:rPr>
                 <w:rFonts w:ascii="Times New Roman" w:eastAsia="Times New Roman" w:hAnsi="Times New Roman" w:cs="Times New Roman"/>
-                <w:color w:val="FFFFFF" w:themeColor="background1"/>
+                <w:color w:val="000000"/>
                 <w:sz w:val="18"/>
                 <w:szCs w:val="18"/>
                 <w:lang w:val="en-ID" w:eastAsia="en-ID"/>
@@ -1922,7 +1922,7 @@
             <w:r>
               <w:rPr>
                 <w:rFonts w:ascii="Times New Roman" w:eastAsia="Times New Roman" w:hAnsi="Times New Roman" w:cs="Times New Roman"/>
-                <w:color w:val="FFFFFF" w:themeColor="background1"/>
+                <w:color w:val="000000"/>
                 <w:sz w:val="18"/>
                 <w:szCs w:val="18"/>
                 <w:lang w:val="en-ID" w:eastAsia="en-ID"/>
@@ -1941,7 +1941,7 @@
               <w:jc w:val="center"/>
               <w:rPr>
                 <w:rFonts w:ascii="Times New Roman" w:eastAsia="Times New Roman" w:hAnsi="Times New Roman" w:cs="Times New Roman"/>
-                <w:color w:val="FFFFFF" w:themeColor="background1"/>
+                <w:color w:val="000000"/>
                 <w:sz w:val="18"/>
                 <w:szCs w:val="18"/>
                 <w:lang w:val="en-ID" w:eastAsia="en-ID"/>
@@ -1951,7 +1951,7 @@
             <w:r>
               <w:rPr>
                 <w:rFonts w:ascii="Times New Roman" w:eastAsia="Times New Roman" w:hAnsi="Times New Roman" w:cs="Times New Roman"/>
-                <w:color w:val="FFFFFF" w:themeColor="background1"/>
+                <w:color w:val="000000"/>
                 <w:sz w:val="18"/>
                 <w:szCs w:val="18"/>
                 <w:lang w:val="en-ID" w:eastAsia="en-ID"/>
@@ -1962,7 +1962,7 @@
             <w:r>
               <w:rPr>
                 <w:rFonts w:ascii="Times New Roman" w:eastAsia="Times New Roman" w:hAnsi="Times New Roman" w:cs="Times New Roman"/>
-                <w:color w:val="FFFFFF" w:themeColor="background1"/>
+                <w:color w:val="000000"/>
                 <w:sz w:val="18"/>
                 <w:szCs w:val="18"/>
                 <w:lang w:val="en-ID" w:eastAsia="en-ID"/>
@@ -1981,7 +1981,7 @@
               <w:jc w:val="center"/>
               <w:rPr>
                 <w:rFonts w:ascii="Times New Roman" w:eastAsia="Times New Roman" w:hAnsi="Times New Roman" w:cs="Times New Roman"/>
-                <w:color w:val="FFFFFF" w:themeColor="background1"/>
+                <w:color w:val="000000"/>
                 <w:sz w:val="18"/>
                 <w:szCs w:val="18"/>
                 <w:lang w:val="en-ID" w:eastAsia="en-ID"/>
@@ -1990,7 +1990,7 @@
             <w:r>
               <w:rPr>
                 <w:rFonts w:ascii="Times New Roman" w:eastAsia="Times New Roman" w:hAnsi="Times New Roman" w:cs="Times New Roman"/>
-                <w:color w:val="FFFFFF" w:themeColor="background1"/>
+                <w:color w:val="000000"/>
                 <w:sz w:val="18"/>
                 <w:szCs w:val="18"/>
                 <w:lang w:val="en-ID" w:eastAsia="en-ID"/>
@@ -2008,7 +2008,7 @@
               <w:jc w:val="center"/>
               <w:rPr>
                 <w:rFonts w:ascii="Times New Roman" w:eastAsia="Times New Roman" w:hAnsi="Times New Roman" w:cs="Times New Roman"/>
-                <w:color w:val="FFFFFF" w:themeColor="background1"/>
+                <w:color w:val="000000"/>
                 <w:sz w:val="18"/>
                 <w:szCs w:val="18"/>
                 <w:lang w:val="en-ID" w:eastAsia="en-ID"/>
@@ -2018,7 +2018,7 @@
             <w:r>
               <w:rPr>
                 <w:rFonts w:ascii="Times New Roman" w:eastAsia="Times New Roman" w:hAnsi="Times New Roman" w:cs="Times New Roman"/>
-                <w:color w:val="FFFFFF" w:themeColor="background1"/>
+                <w:color w:val="000000"/>
                 <w:sz w:val="18"/>
                 <w:szCs w:val="18"/>
                 <w:lang w:val="en-ID" w:eastAsia="en-ID"/>
@@ -2029,7 +2029,7 @@
             <w:r>
               <w:rPr>
                 <w:rFonts w:ascii="Times New Roman" w:eastAsia="Times New Roman" w:hAnsi="Times New Roman" w:cs="Times New Roman"/>
-                <w:color w:val="FFFFFF" w:themeColor="background1"/>
+                <w:color w:val="000000"/>
                 <w:sz w:val="18"/>
                 <w:szCs w:val="18"/>
                 <w:lang w:val="en-ID" w:eastAsia="en-ID"/>
@@ -2047,7 +2047,7 @@
               <w:jc w:val="center"/>
               <w:rPr>
                 <w:rFonts w:ascii="Times New Roman" w:eastAsia="Times New Roman" w:hAnsi="Times New Roman" w:cs="Times New Roman"/>
-                <w:color w:val="FFFFFF" w:themeColor="background1"/>
+                <w:color w:val="000000"/>
                 <w:sz w:val="18"/>
                 <w:szCs w:val="18"/>
                 <w:lang w:val="en-ID" w:eastAsia="en-ID"/>
@@ -2056,7 +2056,7 @@
             <w:r>
               <w:rPr>
                 <w:rFonts w:ascii="Times New Roman" w:eastAsia="Times New Roman" w:hAnsi="Times New Roman" w:cs="Times New Roman"/>
-                <w:color w:val="FFFFFF" w:themeColor="background1"/>
+                <w:color w:val="000000"/>
                 <w:sz w:val="18"/>
                 <w:szCs w:val="18"/>
                 <w:lang w:val="en-ID" w:eastAsia="en-ID"/>
@@ -2067,7 +2067,7 @@
             <w:r>
               <w:rPr>
                 <w:rFonts w:ascii="Times New Roman" w:eastAsia="Times New Roman" w:hAnsi="Times New Roman" w:cs="Times New Roman"/>
-                <w:color w:val="FFFFFF" w:themeColor="background1"/>
+                <w:color w:val="000000"/>
                 <w:sz w:val="18"/>
                 <w:szCs w:val="18"/>
                 <w:lang w:val="en-ID" w:eastAsia="en-ID"/>
@@ -2078,7 +2078,7 @@
             <w:r>
               <w:rPr>
                 <w:rFonts w:ascii="Times New Roman" w:eastAsia="Times New Roman" w:hAnsi="Times New Roman" w:cs="Times New Roman"/>
-                <w:color w:val="FFFFFF" w:themeColor="background1"/>
+                <w:color w:val="000000"/>
                 <w:sz w:val="18"/>
                 <w:szCs w:val="18"/>
                 <w:lang w:val="en-ID" w:eastAsia="en-ID"/>
@@ -2095,7 +2095,7 @@
         <w:rPr>
           <w:rFonts w:ascii="Times New Roman" w:hAnsi="Times New Roman" w:cs="Times New Roman"/>
           <w:b/>
-          <w:color w:val="FFFFFF" w:themeColor="background1"/>
+          <w:color w:val="000000"/>
         </w:rPr>
       </w:pPr>
       <w:proofErr w:type="gramStart"/>
@@ -2103,7 +2103,7 @@
         <w:rPr>
           <w:rFonts w:ascii="Times New Roman" w:hAnsi="Times New Roman" w:cs="Times New Roman"/>
           <w:b/>
-          <w:color w:val="FFFFFF" w:themeColor="background1"/>
+          <w:color w:val="000000"/>
         </w:rPr>
         <w:t>Note :</w:t>
       </w:r>
@@ -2112,7 +2112,7 @@
         <w:rPr>
           <w:rFonts w:ascii="Times New Roman" w:hAnsi="Times New Roman" w:cs="Times New Roman"/>
           <w:b/>
-          <w:color w:val="FFFFFF" w:themeColor="background1"/>
+          <w:color w:val="000000"/>
         </w:rPr>
         <w:t xml:space="preserve"> </w:t>
       </w:r>
@@ -2129,7 +2129,7 @@
           <w:rFonts w:ascii="Times New Roman" w:hAnsi="Times New Roman" w:cs="Times New Roman"/>
           <w:b/>
           <w:i/>
-          <w:color w:val="FFFFFF" w:themeColor="background1"/>
+          <w:color w:val="000000"/>
         </w:rPr>
       </w:pPr>
       <w:r>
@@ -2137,7 +2137,7 @@
           <w:rFonts w:ascii="Times New Roman" w:hAnsi="Times New Roman" w:cs="Times New Roman"/>
           <w:b/>
           <w:i/>
-          <w:color w:val="FFFFFF" w:themeColor="background1"/>
+          <w:color w:val="000000"/>
         </w:rPr>
         <w:t xml:space="preserve"> </w:t>
       </w:r>
@@ -2147,7 +2147,7 @@
           <w:rFonts w:ascii="Times New Roman" w:hAnsi="Times New Roman" w:cs="Times New Roman"/>
           <w:b/>
           <w:i/>
-          <w:color w:val="FFFFFF" w:themeColor="background1"/>
+          <w:color w:val="000000"/>
         </w:rPr>
         <w:t>Dp</w:t>
       </w:r>
@@ -2157,7 +2157,7 @@
           <w:rFonts w:ascii="Times New Roman" w:hAnsi="Times New Roman" w:cs="Times New Roman"/>
           <w:b/>
           <w:i/>
-          <w:color w:val="FFFFFF" w:themeColor="background1"/>
+          <w:color w:val="000000"/>
         </w:rPr>
         <w:t xml:space="preserve"> </w:t>
       </w:r>
@@ -2167,7 +2167,7 @@
           <w:rFonts w:ascii="Times New Roman" w:hAnsi="Times New Roman" w:cs="Times New Roman"/>
           <w:b/>
           <w:i/>
-          <w:color w:val="FFFFFF" w:themeColor="background1"/>
+          <w:color w:val="000000"/>
         </w:rPr>
         <w:t>Rp</w:t>
       </w:r>
@@ -2177,7 +2177,7 @@
           <w:rFonts w:ascii="Times New Roman" w:hAnsi="Times New Roman" w:cs="Times New Roman"/>
           <w:b/>
           <w:i/>
-          <w:color w:val="FFFFFF" w:themeColor="background1"/>
+          <w:color w:val="000000"/>
         </w:rPr>
         <w:t xml:space="preserve">. </w:t>
       </w:r>
@@ -2186,7 +2186,7 @@
           <w:rFonts w:ascii="Times New Roman" w:hAnsi="Times New Roman" w:cs="Times New Roman"/>
           <w:b/>
           <w:i/>
-          <w:color w:val="FFFFFF" w:themeColor="background1"/>
+          <w:color w:val="000000"/>
         </w:rPr>
         <w:t xml:space="preserve">${nominal_dp}</w:t>
       </w:r>
@@ -2195,7 +2195,7 @@
           <w:rFonts w:ascii="Times New Roman" w:hAnsi="Times New Roman" w:cs="Times New Roman"/>
           <w:b/>
           <w:i/>
-          <w:color w:val="FFFFFF" w:themeColor="background1"/>
+          <w:color w:val="000000"/>
         </w:rPr>
         <w:t>,-  (</w:t>
       </w:r>
@@ -2205,7 +2205,7 @@
           <w:rFonts w:ascii="Times New Roman" w:hAnsi="Times New Roman" w:cs="Times New Roman"/>
           <w:b/>
           <w:i/>
-          <w:color w:val="FFFFFF" w:themeColor="background1"/>
+          <w:color w:val="000000"/>
         </w:rPr>
         <w:t xml:space="preserve">${dp_terbilang}</w:t>
       </w:r>
@@ -2215,7 +2215,7 @@
           <w:rFonts w:ascii="Times New Roman" w:hAnsi="Times New Roman" w:cs="Times New Roman"/>
           <w:b/>
           <w:i/>
-          <w:color w:val="FFFFFF" w:themeColor="background1"/>
+          <w:color w:val="000000"/>
         </w:rPr>
         <w:t xml:space="preserve"/>
       </w:r>
@@ -2225,7 +2225,7 @@
           <w:rFonts w:ascii="Times New Roman" w:hAnsi="Times New Roman" w:cs="Times New Roman"/>
           <w:b/>
           <w:i/>
-          <w:color w:val="FFFFFF" w:themeColor="background1"/>
+          <w:color w:val="000000"/>
         </w:rPr>
         <w:t xml:space="preserve"/>
       </w:r>
@@ -2235,7 +2235,7 @@
           <w:rFonts w:ascii="Times New Roman" w:hAnsi="Times New Roman" w:cs="Times New Roman"/>
           <w:b/>
           <w:i/>
-          <w:color w:val="FFFFFF" w:themeColor="background1"/>
+          <w:color w:val="000000"/>
         </w:rPr>
         <w:t xml:space="preserve"/>
       </w:r>
@@ -2245,7 +2245,7 @@
           <w:rFonts w:ascii="Times New Roman" w:hAnsi="Times New Roman" w:cs="Times New Roman"/>
           <w:b/>
           <w:i/>
-          <w:color w:val="FFFFFF" w:themeColor="background1"/>
+          <w:color w:val="000000"/>
         </w:rPr>
         <w:t xml:space="preserve"/>
       </w:r>
@@ -2255,7 +2255,7 @@
           <w:rFonts w:ascii="Times New Roman" w:hAnsi="Times New Roman" w:cs="Times New Roman"/>
           <w:b/>
           <w:i/>
-          <w:color w:val="FFFFFF" w:themeColor="background1"/>
+          <w:color w:val="000000"/>
         </w:rPr>
         <w:t xml:space="preserve"/>
       </w:r>
@@ -2265,7 +2265,7 @@
           <w:rFonts w:ascii="Times New Roman" w:hAnsi="Times New Roman" w:cs="Times New Roman"/>
           <w:b/>
           <w:i/>
-          <w:color w:val="FFFFFF" w:themeColor="background1"/>
+          <w:color w:val="000000"/>
         </w:rPr>
         <w:t xml:space="preserve"/>
       </w:r>
@@ -2275,7 +2275,7 @@
           <w:rFonts w:ascii="Times New Roman" w:hAnsi="Times New Roman" w:cs="Times New Roman"/>
           <w:b/>
           <w:i/>
-          <w:color w:val="FFFFFF" w:themeColor="background1"/>
+          <w:color w:val="000000"/>
         </w:rPr>
         <w:t xml:space="preserve"/>
       </w:r>
@@ -2285,7 +2285,7 @@
           <w:rFonts w:ascii="Times New Roman" w:hAnsi="Times New Roman" w:cs="Times New Roman"/>
           <w:b/>
           <w:i/>
-          <w:color w:val="FFFFFF" w:themeColor="background1"/>
+          <w:color w:val="000000"/>
         </w:rPr>
         <w:t xml:space="preserve"/>
       </w:r>
@@ -2295,7 +2295,7 @@
           <w:rFonts w:ascii="Times New Roman" w:hAnsi="Times New Roman" w:cs="Times New Roman"/>
           <w:b/>
           <w:i/>
-          <w:color w:val="FFFFFF" w:themeColor="background1"/>
+          <w:color w:val="000000"/>
         </w:rPr>
         <w:t xml:space="preserve"/>
       </w:r>
@@ -2304,7 +2304,7 @@
           <w:rFonts w:ascii="Times New Roman" w:hAnsi="Times New Roman" w:cs="Times New Roman"/>
           <w:b/>
           <w:i/>
-          <w:color w:val="FFFFFF" w:themeColor="background1"/>
+          <w:color w:val="000000"/>
         </w:rPr>
         <w:t xml:space="preserve">) </w:t>
       </w:r>
@@ -2319,7 +2319,7 @@
         <w:spacing w:after="120" w:line="240" w:lineRule="auto"/>
         <w:rPr>
           <w:b/>
-          <w:color w:val="FFFFFF" w:themeColor="background1"/>
+          <w:color w:val="000000"/>
         </w:rPr>
       </w:pPr>
       <w:proofErr w:type="spellStart"/>
@@ -2328,7 +2328,7 @@
           <w:rFonts w:ascii="Times New Roman" w:hAnsi="Times New Roman" w:cs="Times New Roman"/>
           <w:b/>
           <w:i/>
-          <w:color w:val="FFFFFF" w:themeColor="background1"/>
+          <w:color w:val="000000"/>
         </w:rPr>
         <w:t>Kekurangan</w:t>
       </w:r>
@@ -2338,7 +2338,7 @@
           <w:rFonts w:ascii="Times New Roman" w:hAnsi="Times New Roman" w:cs="Times New Roman"/>
           <w:b/>
           <w:i/>
-          <w:color w:val="FFFFFF" w:themeColor="background1"/>
+          <w:color w:val="000000"/>
         </w:rPr>
         <w:t xml:space="preserve"> </w:t>
       </w:r>
@@ -2348,7 +2348,7 @@
           <w:rFonts w:ascii="Times New Roman" w:hAnsi="Times New Roman" w:cs="Times New Roman"/>
           <w:b/>
           <w:i/>
-          <w:color w:val="FFFFFF" w:themeColor="background1"/>
+          <w:color w:val="000000"/>
         </w:rPr>
         <w:t>Dp</w:t>
       </w:r>
@@ -2358,7 +2358,7 @@
           <w:rFonts w:ascii="Times New Roman" w:hAnsi="Times New Roman" w:cs="Times New Roman"/>
           <w:b/>
           <w:i/>
-          <w:color w:val="FFFFFF" w:themeColor="background1"/>
+          <w:color w:val="000000"/>
         </w:rPr>
         <w:t xml:space="preserve">. </w:t>
       </w:r>
@@ -2368,7 +2368,7 @@
           <w:rFonts w:ascii="Times New Roman" w:hAnsi="Times New Roman" w:cs="Times New Roman"/>
           <w:b/>
           <w:i/>
-          <w:color w:val="FFFFFF" w:themeColor="background1"/>
+          <w:color w:val="000000"/>
         </w:rPr>
         <w:t>Rp</w:t>
       </w:r>
@@ -2378,7 +2378,7 @@
           <w:rFonts w:ascii="Times New Roman" w:hAnsi="Times New Roman" w:cs="Times New Roman"/>
           <w:b/>
           <w:i/>
-          <w:color w:val="FFFFFF" w:themeColor="background1"/>
+          <w:color w:val="000000"/>
         </w:rPr>
         <w:t xml:space="preserve">. </w:t>
       </w:r>
@@ -2387,7 +2387,7 @@
           <w:rFonts w:ascii="Times New Roman" w:hAnsi="Times New Roman" w:cs="Times New Roman"/>
           <w:b/>
           <w:i/>
-          <w:color w:val="FFFFFF" w:themeColor="background1"/>
+          <w:color w:val="000000"/>
         </w:rPr>
         <w:t xml:space="preserve">${sisa_dp}</w:t>
       </w:r>
@@ -2397,7 +2397,7 @@
           <w:rFonts w:ascii="Times New Roman" w:hAnsi="Times New Roman" w:cs="Times New Roman"/>
           <w:b/>
           <w:i/>
-          <w:color w:val="FFFFFF" w:themeColor="background1"/>
+          <w:color w:val="000000"/>
         </w:rPr>
         <w:t>,-</w:t>
       </w:r>
@@ -2407,7 +2407,7 @@
           <w:rFonts w:ascii="Times New Roman" w:hAnsi="Times New Roman" w:cs="Times New Roman"/>
           <w:b/>
           <w:i/>
-          <w:color w:val="FFFFFF" w:themeColor="background1"/>
+          <w:color w:val="000000"/>
         </w:rPr>
         <w:t xml:space="preserve"> ( </w:t>
       </w:r>
@@ -2417,7 +2417,7 @@
           <w:rFonts w:ascii="Times New Roman" w:hAnsi="Times New Roman" w:cs="Times New Roman"/>
           <w:b/>
           <w:i/>
-          <w:color w:val="FFFFFF" w:themeColor="background1"/>
+          <w:color w:val="000000"/>
         </w:rPr>
         <w:t xml:space="preserve">${sisa_dp_terbilang}</w:t>
       </w:r>
@@ -2427,7 +2427,7 @@
           <w:rFonts w:ascii="Times New Roman" w:hAnsi="Times New Roman" w:cs="Times New Roman"/>
           <w:b/>
           <w:i/>
-          <w:color w:val="FFFFFF" w:themeColor="background1"/>
+          <w:color w:val="000000"/>
         </w:rPr>
         <w:t xml:space="preserve"/>
       </w:r>
@@ -2437,7 +2437,7 @@
           <w:rFonts w:ascii="Times New Roman" w:hAnsi="Times New Roman" w:cs="Times New Roman"/>
           <w:b/>
           <w:i/>
-          <w:color w:val="FFFFFF" w:themeColor="background1"/>
+          <w:color w:val="000000"/>
         </w:rPr>
         <w:t xml:space="preserve"/>
       </w:r>
@@ -2447,7 +2447,7 @@
           <w:rFonts w:ascii="Times New Roman" w:hAnsi="Times New Roman" w:cs="Times New Roman"/>
           <w:b/>
           <w:i/>
-          <w:color w:val="FFFFFF" w:themeColor="background1"/>
+          <w:color w:val="000000"/>
         </w:rPr>
         <w:t xml:space="preserve"/>
       </w:r>
@@ -2457,7 +2457,7 @@
           <w:rFonts w:ascii="Times New Roman" w:hAnsi="Times New Roman" w:cs="Times New Roman"/>
           <w:b/>
           <w:i/>
-          <w:color w:val="FFFFFF" w:themeColor="background1"/>
+          <w:color w:val="000000"/>
         </w:rPr>
         <w:t xml:space="preserve"/>
       </w:r>
@@ -2467,7 +2467,7 @@
           <w:rFonts w:ascii="Times New Roman" w:hAnsi="Times New Roman" w:cs="Times New Roman"/>
           <w:b/>
           <w:i/>
-          <w:color w:val="FFFFFF" w:themeColor="background1"/>
+          <w:color w:val="000000"/>
         </w:rPr>
         <w:t xml:space="preserve"/>
       </w:r>
@@ -2477,7 +2477,7 @@
           <w:rFonts w:ascii="Times New Roman" w:hAnsi="Times New Roman" w:cs="Times New Roman"/>
           <w:b/>
           <w:i/>
-          <w:color w:val="FFFFFF" w:themeColor="background1"/>
+          <w:color w:val="000000"/>
         </w:rPr>
         <w:t xml:space="preserve"/>
       </w:r>
@@ -2487,7 +2487,7 @@
           <w:rFonts w:ascii="Times New Roman" w:hAnsi="Times New Roman" w:cs="Times New Roman"/>
           <w:b/>
           <w:i/>
-          <w:color w:val="FFFFFF" w:themeColor="background1"/>
+          <w:color w:val="000000"/>
         </w:rPr>
         <w:t xml:space="preserve"/>
       </w:r>
@@ -2496,7 +2496,7 @@
           <w:rFonts w:ascii="Times New Roman" w:hAnsi="Times New Roman" w:cs="Times New Roman"/>
           <w:b/>
           <w:i/>
-          <w:color w:val="FFFFFF" w:themeColor="background1"/>
+          <w:color w:val="000000"/>
         </w:rPr>
         <w:t xml:space="preserve">) </w:t>
       </w:r>
@@ -2506,7 +2506,7 @@
           <w:rFonts w:ascii="Times New Roman" w:hAnsi="Times New Roman" w:cs="Times New Roman"/>
           <w:b/>
           <w:i/>
-          <w:color w:val="FFFFFF" w:themeColor="background1"/>
+          <w:color w:val="000000"/>
         </w:rPr>
         <w:t>dibayarkan</w:t>
       </w:r>
@@ -2516,7 +2516,7 @@
           <w:rFonts w:ascii="Times New Roman" w:hAnsi="Times New Roman" w:cs="Times New Roman"/>
           <w:b/>
           <w:i/>
-          <w:color w:val="FFFFFF" w:themeColor="background1"/>
+          <w:color w:val="000000"/>
         </w:rPr>
         <w:t xml:space="preserve"> </w:t>
       </w:r>
@@ -2526,7 +2526,7 @@
           <w:rFonts w:ascii="Times New Roman" w:hAnsi="Times New Roman" w:cs="Times New Roman"/>
           <w:b/>
           <w:i/>
-          <w:color w:val="FFFFFF" w:themeColor="background1"/>
+          <w:color w:val="000000"/>
         </w:rPr>
         <w:t>sebelum</w:t>
       </w:r>
@@ -2536,7 +2536,7 @@
           <w:rFonts w:ascii="Times New Roman" w:hAnsi="Times New Roman" w:cs="Times New Roman"/>
           <w:b/>
           <w:i/>
-          <w:color w:val="FFFFFF" w:themeColor="background1"/>
+          <w:color w:val="000000"/>
         </w:rPr>
         <w:t xml:space="preserve"> </w:t>
       </w:r>
@@ -2546,7 +2546,7 @@
           <w:rFonts w:ascii="Times New Roman" w:hAnsi="Times New Roman" w:cs="Times New Roman"/>
           <w:b/>
           <w:i/>
-          <w:color w:val="FFFFFF" w:themeColor="background1"/>
+          <w:color w:val="000000"/>
         </w:rPr>
         <w:t>akad</w:t>
       </w:r>
@@ -2556,7 +2556,7 @@
           <w:rFonts w:ascii="Times New Roman" w:hAnsi="Times New Roman" w:cs="Times New Roman"/>
           <w:b/>
           <w:i/>
-          <w:color w:val="FFFFFF" w:themeColor="background1"/>
+          <w:color w:val="000000"/>
         </w:rPr>
         <w:t xml:space="preserve"> </w:t>
       </w:r>
@@ -2566,7 +2566,7 @@
           <w:rFonts w:ascii="Times New Roman" w:hAnsi="Times New Roman" w:cs="Times New Roman"/>
           <w:b/>
           <w:i/>
-          <w:color w:val="FFFFFF" w:themeColor="background1"/>
+          <w:color w:val="000000"/>
         </w:rPr>
         <w:t>kredit</w:t>
       </w:r>
@@ -2576,7 +2576,7 @@
           <w:rFonts w:ascii="Times New Roman" w:hAnsi="Times New Roman" w:cs="Times New Roman"/>
           <w:b/>
           <w:i/>
-          <w:color w:val="FFFFFF" w:themeColor="background1"/>
+          <w:color w:val="000000"/>
         </w:rPr>
         <w:t xml:space="preserve">/ </w:t>
       </w:r>
@@ -2586,7 +2586,7 @@
           <w:rFonts w:ascii="Times New Roman" w:hAnsi="Times New Roman" w:cs="Times New Roman"/>
           <w:b/>
           <w:i/>
-          <w:color w:val="FFFFFF" w:themeColor="background1"/>
+          <w:color w:val="000000"/>
         </w:rPr>
         <w:t>Setelah</w:t>
       </w:r>
@@ -2596,7 +2596,7 @@
           <w:rFonts w:ascii="Times New Roman" w:hAnsi="Times New Roman" w:cs="Times New Roman"/>
           <w:b/>
           <w:i/>
-          <w:color w:val="FFFFFF" w:themeColor="background1"/>
+          <w:color w:val="000000"/>
         </w:rPr>
         <w:t xml:space="preserve"> SP3K Bank </w:t>
       </w:r>
@@ -2606,7 +2606,7 @@
           <w:rFonts w:ascii="Times New Roman" w:hAnsi="Times New Roman" w:cs="Times New Roman"/>
           <w:b/>
           <w:i/>
-          <w:color w:val="FFFFFF" w:themeColor="background1"/>
+          <w:color w:val="000000"/>
         </w:rPr>
         <w:t>keluar</w:t>
       </w:r>
@@ -2616,7 +2616,7 @@
           <w:rFonts w:ascii="Times New Roman" w:hAnsi="Times New Roman" w:cs="Times New Roman"/>
           <w:b/>
           <w:i/>
-          <w:color w:val="FFFFFF" w:themeColor="background1"/>
+          <w:color w:val="000000"/>
         </w:rPr>
         <w:t>.</w:t>
       </w:r>
@@ -3447,13 +3447,13 @@
         <w:jc w:val="both"/>
         <w:rPr>
           <w:rFonts w:ascii="Times New Roman" w:hAnsi="Times New Roman" w:cs="Times New Roman"/>
-          <w:color w:val="FFFFFF" w:themeColor="background1"/>
-        </w:rPr>
-      </w:pPr>
-      <w:r>
-        <w:rPr>
-          <w:rFonts w:ascii="Times New Roman" w:hAnsi="Times New Roman" w:cs="Times New Roman"/>
-          <w:color w:val="FFFFFF" w:themeColor="background1"/>
+          <w:color w:val="000000"/>
+        </w:rPr>
+      </w:pPr>
+      <w:r>
+        <w:rPr>
+          <w:rFonts w:ascii="Times New Roman" w:hAnsi="Times New Roman" w:cs="Times New Roman"/>
+          <w:color w:val="000000"/>
         </w:rPr>
         <w:t xml:space="preserve">BPHTB ( Bea </w:t>
       </w:r>
@@ -3461,7 +3461,7 @@
       <w:r>
         <w:rPr>
           <w:rFonts w:ascii="Times New Roman" w:hAnsi="Times New Roman" w:cs="Times New Roman"/>
-          <w:color w:val="FFFFFF" w:themeColor="background1"/>
+          <w:color w:val="000000"/>
         </w:rPr>
         <w:t>Peralihan</w:t>
       </w:r>
@@ -3469,15 +3469,15 @@
       <w:r>
         <w:rPr>
           <w:rFonts w:ascii="Times New Roman" w:hAnsi="Times New Roman" w:cs="Times New Roman"/>
-          <w:color w:val="FFFFFF" w:themeColor="background1"/>
-        </w:rPr>
-        <w:t xml:space="preserve"> </w:t>
-      </w:r>
-      <w:proofErr w:type="spellStart"/>
-      <w:r>
-        <w:rPr>
-          <w:rFonts w:ascii="Times New Roman" w:hAnsi="Times New Roman" w:cs="Times New Roman"/>
-          <w:color w:val="FFFFFF" w:themeColor="background1"/>
+          <w:color w:val="000000"/>
+        </w:rPr>
+        <w:t xml:space="preserve"> </w:t>
+      </w:r>
+      <w:proofErr w:type="spellStart"/>
+      <w:r>
+        <w:rPr>
+          <w:rFonts w:ascii="Times New Roman" w:hAnsi="Times New Roman" w:cs="Times New Roman"/>
+          <w:color w:val="000000"/>
         </w:rPr>
         <w:t>Hak</w:t>
       </w:r>
@@ -3485,15 +3485,15 @@
       <w:r>
         <w:rPr>
           <w:rFonts w:ascii="Times New Roman" w:hAnsi="Times New Roman" w:cs="Times New Roman"/>
-          <w:color w:val="FFFFFF" w:themeColor="background1"/>
-        </w:rPr>
-        <w:t xml:space="preserve"> </w:t>
-      </w:r>
-      <w:proofErr w:type="spellStart"/>
-      <w:r>
-        <w:rPr>
-          <w:rFonts w:ascii="Times New Roman" w:hAnsi="Times New Roman" w:cs="Times New Roman"/>
-          <w:color w:val="FFFFFF" w:themeColor="background1"/>
+          <w:color w:val="000000"/>
+        </w:rPr>
+        <w:t xml:space="preserve"> </w:t>
+      </w:r>
+      <w:proofErr w:type="spellStart"/>
+      <w:r>
+        <w:rPr>
+          <w:rFonts w:ascii="Times New Roman" w:hAnsi="Times New Roman" w:cs="Times New Roman"/>
+          <w:color w:val="000000"/>
         </w:rPr>
         <w:t>atas</w:t>
       </w:r>
@@ -3501,7 +3501,7 @@
       <w:r>
         <w:rPr>
           <w:rFonts w:ascii="Times New Roman" w:hAnsi="Times New Roman" w:cs="Times New Roman"/>
-          <w:color w:val="FFFFFF" w:themeColor="background1"/>
+          <w:color w:val="000000"/>
         </w:rPr>
         <w:t xml:space="preserve"> Tanah </w:t>
       </w:r>
@@ -3509,7 +3509,7 @@
       <w:r>
         <w:rPr>
           <w:rFonts w:ascii="Times New Roman" w:hAnsi="Times New Roman" w:cs="Times New Roman"/>
-          <w:color w:val="FFFFFF" w:themeColor="background1"/>
+          <w:color w:val="000000"/>
         </w:rPr>
         <w:t>dan</w:t>
       </w:r>
@@ -3517,15 +3517,15 @@
       <w:r>
         <w:rPr>
           <w:rFonts w:ascii="Times New Roman" w:hAnsi="Times New Roman" w:cs="Times New Roman"/>
-          <w:color w:val="FFFFFF" w:themeColor="background1"/>
-        </w:rPr>
-        <w:t xml:space="preserve"> </w:t>
-      </w:r>
-      <w:proofErr w:type="spellStart"/>
-      <w:r>
-        <w:rPr>
-          <w:rFonts w:ascii="Times New Roman" w:hAnsi="Times New Roman" w:cs="Times New Roman"/>
-          <w:color w:val="FFFFFF" w:themeColor="background1"/>
+          <w:color w:val="000000"/>
+        </w:rPr>
+        <w:t xml:space="preserve"> </w:t>
+      </w:r>
+      <w:proofErr w:type="spellStart"/>
+      <w:r>
+        <w:rPr>
+          <w:rFonts w:ascii="Times New Roman" w:hAnsi="Times New Roman" w:cs="Times New Roman"/>
+          <w:color w:val="000000"/>
         </w:rPr>
         <w:t>Bangunan</w:t>
       </w:r>
@@ -3533,7 +3533,7 @@
       <w:r>
         <w:rPr>
           <w:rFonts w:ascii="Times New Roman" w:hAnsi="Times New Roman" w:cs="Times New Roman"/>
-          <w:color w:val="FFFFFF" w:themeColor="background1"/>
+          <w:color w:val="000000"/>
         </w:rPr>
         <w:t xml:space="preserve">) </w:t>
       </w:r>
@@ -3541,7 +3541,7 @@
       <w:r>
         <w:rPr>
           <w:rFonts w:ascii="Times New Roman" w:hAnsi="Times New Roman" w:cs="Times New Roman"/>
-          <w:color w:val="FFFFFF" w:themeColor="background1"/>
+          <w:color w:val="000000"/>
         </w:rPr>
         <w:t>dan</w:t>
       </w:r>
@@ -3549,15 +3549,15 @@
       <w:r>
         <w:rPr>
           <w:rFonts w:ascii="Times New Roman" w:hAnsi="Times New Roman" w:cs="Times New Roman"/>
-          <w:color w:val="FFFFFF" w:themeColor="background1"/>
-        </w:rPr>
-        <w:t xml:space="preserve"> </w:t>
-      </w:r>
-      <w:proofErr w:type="spellStart"/>
-      <w:r>
-        <w:rPr>
-          <w:rFonts w:ascii="Times New Roman" w:hAnsi="Times New Roman" w:cs="Times New Roman"/>
-          <w:color w:val="FFFFFF" w:themeColor="background1"/>
+          <w:color w:val="000000"/>
+        </w:rPr>
+        <w:t xml:space="preserve"> </w:t>
+      </w:r>
+      <w:proofErr w:type="spellStart"/>
+      <w:r>
+        <w:rPr>
+          <w:rFonts w:ascii="Times New Roman" w:hAnsi="Times New Roman" w:cs="Times New Roman"/>
+          <w:color w:val="000000"/>
         </w:rPr>
         <w:t>validasinya</w:t>
       </w:r>
@@ -3565,15 +3565,15 @@
       <w:r>
         <w:rPr>
           <w:rFonts w:ascii="Times New Roman" w:hAnsi="Times New Roman" w:cs="Times New Roman"/>
-          <w:color w:val="FFFFFF" w:themeColor="background1"/>
-        </w:rPr>
-        <w:t xml:space="preserve"> </w:t>
-      </w:r>
-      <w:proofErr w:type="spellStart"/>
-      <w:r>
-        <w:rPr>
-          <w:rFonts w:ascii="Times New Roman" w:hAnsi="Times New Roman" w:cs="Times New Roman"/>
-          <w:color w:val="FFFFFF" w:themeColor="background1"/>
+          <w:color w:val="000000"/>
+        </w:rPr>
+        <w:t xml:space="preserve"> </w:t>
+      </w:r>
+      <w:proofErr w:type="spellStart"/>
+      <w:r>
+        <w:rPr>
+          <w:rFonts w:ascii="Times New Roman" w:hAnsi="Times New Roman" w:cs="Times New Roman"/>
+          <w:color w:val="000000"/>
         </w:rPr>
         <w:t>menjadi</w:t>
       </w:r>
@@ -3581,15 +3581,15 @@
       <w:r>
         <w:rPr>
           <w:rFonts w:ascii="Times New Roman" w:hAnsi="Times New Roman" w:cs="Times New Roman"/>
-          <w:color w:val="FFFFFF" w:themeColor="background1"/>
-        </w:rPr>
-        <w:t xml:space="preserve"> </w:t>
-      </w:r>
-      <w:proofErr w:type="spellStart"/>
-      <w:r>
-        <w:rPr>
-          <w:rFonts w:ascii="Times New Roman" w:hAnsi="Times New Roman" w:cs="Times New Roman"/>
-          <w:color w:val="FFFFFF" w:themeColor="background1"/>
+          <w:color w:val="000000"/>
+        </w:rPr>
+        <w:t xml:space="preserve"> </w:t>
+      </w:r>
+      <w:proofErr w:type="spellStart"/>
+      <w:r>
+        <w:rPr>
+          <w:rFonts w:ascii="Times New Roman" w:hAnsi="Times New Roman" w:cs="Times New Roman"/>
+          <w:color w:val="000000"/>
         </w:rPr>
         <w:t>beban</w:t>
       </w:r>
@@ -3597,15 +3597,15 @@
       <w:r>
         <w:rPr>
           <w:rFonts w:ascii="Times New Roman" w:hAnsi="Times New Roman" w:cs="Times New Roman"/>
-          <w:color w:val="FFFFFF" w:themeColor="background1"/>
-        </w:rPr>
-        <w:t xml:space="preserve"> </w:t>
-      </w:r>
-      <w:proofErr w:type="spellStart"/>
-      <w:r>
-        <w:rPr>
-          <w:rFonts w:ascii="Times New Roman" w:hAnsi="Times New Roman" w:cs="Times New Roman"/>
-          <w:color w:val="FFFFFF" w:themeColor="background1"/>
+          <w:color w:val="000000"/>
+        </w:rPr>
+        <w:t xml:space="preserve"> </w:t>
+      </w:r>
+      <w:proofErr w:type="spellStart"/>
+      <w:r>
+        <w:rPr>
+          <w:rFonts w:ascii="Times New Roman" w:hAnsi="Times New Roman" w:cs="Times New Roman"/>
+          <w:color w:val="000000"/>
         </w:rPr>
         <w:t>Penjual</w:t>
       </w:r>
@@ -10818,7 +10818,7 @@
       <w:r>
         <w:rPr>
           <w:rFonts w:ascii="Times New Roman" w:hAnsi="Times New Roman" w:cs="Times New Roman"/>
-          <w:color w:val="FFFFFF" w:themeColor="background1"/>
+          <w:color w:val="000000"/>
         </w:rPr>
         <w:t xml:space="preserve">${nama}</w:t>
       </w:r>
@@ -10826,7 +10826,7 @@
       <w:r>
         <w:rPr>
           <w:rFonts w:ascii="Times New Roman" w:hAnsi="Times New Roman" w:cs="Times New Roman"/>
-          <w:color w:val="FFFFFF" w:themeColor="background1"/>
+          <w:color w:val="000000"/>
         </w:rPr>
         <w:t xml:space="preserve"/>
       </w:r>
@@ -10834,7 +10834,7 @@
       <w:r>
         <w:rPr>
           <w:rFonts w:ascii="Times New Roman" w:hAnsi="Times New Roman" w:cs="Times New Roman"/>
-          <w:color w:val="FFFFFF" w:themeColor="background1"/>
+          <w:color w:val="000000"/>
         </w:rPr>
         <w:t xml:space="preserve"/>
       </w:r>
@@ -10842,7 +10842,7 @@
       <w:r>
         <w:rPr>
           <w:rFonts w:ascii="Times New Roman" w:hAnsi="Times New Roman" w:cs="Times New Roman"/>
-          <w:color w:val="FFFFFF" w:themeColor="background1"/>
+          <w:color w:val="000000"/>
         </w:rPr>
         <w:t xml:space="preserve"/>
       </w:r>
@@ -10850,7 +10850,7 @@
       <w:r>
         <w:rPr>
           <w:rFonts w:ascii="Times New Roman" w:hAnsi="Times New Roman" w:cs="Times New Roman"/>
-          <w:color w:val="FFFFFF" w:themeColor="background1"/>
+          <w:color w:val="000000"/>
         </w:rPr>
         <w:t xml:space="preserve"/>
       </w:r>

</xml_diff>